<commit_message>
Update project submission template and testimonial files
</commit_message>
<xml_diff>
--- a/Written_Testimonial.docx
+++ b/Written_Testimonial.docx
@@ -10,18 +10,18 @@
       <w:r>
         <w:rPr/>
         <w:drawing>
-          <wp:anchor distT="0" distB="0" distL="114300" distR="114300" simplePos="0" relativeHeight="2" behindDoc="0" locked="0" layoutInCell="0" allowOverlap="1">
+          <wp:anchor distT="0" distB="0" distL="0" distR="0" simplePos="0" relativeHeight="2" behindDoc="0" locked="0" layoutInCell="0" allowOverlap="1">
             <wp:simplePos x="0" y="0"/>
             <wp:positionH relativeFrom="column">
-              <wp:posOffset>-635</wp:posOffset>
+              <wp:posOffset>6350</wp:posOffset>
             </wp:positionH>
             <wp:positionV relativeFrom="paragraph">
-              <wp:posOffset>326390</wp:posOffset>
+              <wp:posOffset>101600</wp:posOffset>
             </wp:positionV>
-            <wp:extent cx="783590" cy="986790"/>
+            <wp:extent cx="983615" cy="1288415"/>
             <wp:effectExtent l="0" t="0" r="0" b="0"/>
-            <wp:wrapTopAndBottom/>
-            <wp:docPr id="1" name="Picture 1"/>
+            <wp:wrapSquare wrapText="largest"/>
+            <wp:docPr id="1" name="Image1"/>
             <wp:cNvGraphicFramePr>
               <a:graphicFrameLocks xmlns:a="http://schemas.openxmlformats.org/drawingml/2006/main" noChangeAspect="1"/>
             </wp:cNvGraphicFramePr>
@@ -29,182 +29,13 @@
               <a:graphicData uri="http://schemas.openxmlformats.org/drawingml/2006/picture">
                 <pic:pic xmlns:pic="http://schemas.openxmlformats.org/drawingml/2006/picture">
                   <pic:nvPicPr>
-                    <pic:cNvPr id="1" name="Picture 1"/>
+                    <pic:cNvPr id="1" name="Image1"/>
                     <pic:cNvPicPr>
                       <a:picLocks noChangeAspect="1" noChangeArrowheads="1"/>
                     </pic:cNvPicPr>
                   </pic:nvPicPr>
                   <pic:blipFill>
                     <a:blip r:embed="rId2"/>
-                    <a:stretch>
-                      <a:fillRect/>
-                    </a:stretch>
-                  </pic:blipFill>
-                  <pic:spPr bwMode="auto">
-                    <a:xfrm>
-                      <a:off x="0" y="0"/>
-                      <a:ext cx="783590" cy="986790"/>
-                    </a:xfrm>
-                    <a:prstGeom prst="rect">
-                      <a:avLst/>
-                    </a:prstGeom>
-                    <a:noFill/>
-                  </pic:spPr>
-                </pic:pic>
-              </a:graphicData>
-            </a:graphic>
-          </wp:anchor>
-        </w:drawing>
-        <mc:AlternateContent>
-          <mc:Choice Requires="wps">
-            <w:drawing>
-              <wp:anchor distT="12700" distB="12700" distL="12700" distR="12700" simplePos="0" relativeHeight="3" behindDoc="0" locked="0" layoutInCell="1" allowOverlap="1" wp14:anchorId="1E778257">
-                <wp:simplePos x="0" y="0"/>
-                <wp:positionH relativeFrom="column">
-                  <wp:posOffset>-76200</wp:posOffset>
-                </wp:positionH>
-                <wp:positionV relativeFrom="paragraph">
-                  <wp:posOffset>228600</wp:posOffset>
-                </wp:positionV>
-                <wp:extent cx="982980" cy="1287780"/>
-                <wp:effectExtent l="12700" t="12700" r="12700" b="12700"/>
-                <wp:wrapNone/>
-                <wp:docPr id="2" name="Rectangle 1"/>
-                <a:graphic xmlns:a="http://schemas.openxmlformats.org/drawingml/2006/main">
-                  <a:graphicData uri="http://schemas.microsoft.com/office/word/2010/wordprocessingShape">
-                    <wps:wsp>
-                      <wps:cNvSpPr/>
-                      <wps:spPr>
-                        <a:xfrm>
-                          <a:off x="0" y="0"/>
-                          <a:ext cx="983160" cy="1287720"/>
-                        </a:xfrm>
-                        <a:prstGeom prst="rect">
-                          <a:avLst/>
-                        </a:prstGeom>
-                        <a:solidFill>
-                          <a:srgbClr val="4F81BD"/>
-                        </a:solidFill>
-                        <a:ln>
-                          <a:solidFill>
-                            <a:srgbClr val="223852"/>
-                          </a:solidFill>
-                          <a:round/>
-                        </a:ln>
-                      </wps:spPr>
-                      <wps:style>
-                        <a:lnRef idx="2">
-                          <a:schemeClr val="accent1">
-                            <a:shade val="15000"/>
-                          </a:schemeClr>
-                        </a:lnRef>
-                        <a:fillRef idx="1">
-                          <a:schemeClr val="accent1"/>
-                        </a:fillRef>
-                        <a:effectRef idx="0">
-                          <a:schemeClr val="accent1"/>
-                        </a:effectRef>
-                        <a:fontRef idx="minor"/>
-                      </wps:style>
-                      <wps:txbx>
-                        <w:txbxContent>
-                          <w:p>
-                            <w:pPr>
-                              <w:pStyle w:val="FrameContentsuser"/>
-                              <w:spacing w:before="0" w:after="200"/>
-                              <w:jc w:val="center"/>
-                              <w:rPr>
-                                <w:color w:val="FFFFFF"/>
-                              </w:rPr>
-                            </w:pPr>
-                            <w:r>
-                              <w:rPr>
-                                <w:color w:val="FFFFFF"/>
-                              </w:rPr>
-                              <w:t>Your photo</w:t>
-                            </w:r>
-                          </w:p>
-                        </w:txbxContent>
-                      </wps:txbx>
-                      <wps:bodyPr anchor="ctr">
-                        <a:prstTxWarp prst="textNoShape"/>
-                        <a:noAutofit/>
-                      </wps:bodyPr>
-                    </wps:wsp>
-                  </a:graphicData>
-                </a:graphic>
-              </wp:anchor>
-            </w:drawing>
-          </mc:Choice>
-          <mc:Fallback>
-            <w:pict>
-              <v:rect id="shape_0" fillcolor="#4f81bd" stroked="t" o:allowincell="f" style="position:absolute;margin-left:-6pt;margin-top:18pt;width:77.35pt;height:101.35pt;mso-wrap-style:square;v-text-anchor:middle" wp14:anchorId="1E778257">
-                <v:fill o:detectmouseclick="t" type="solid" color2="#b07e42"/>
-                <v:stroke color="#223852" weight="25560" joinstyle="round" endcap="flat"/>
-                <v:textbox>
-                  <w:txbxContent>
-                    <w:p>
-                      <w:pPr>
-                        <w:pStyle w:val="FrameContentsuser"/>
-                        <w:spacing w:before="0" w:after="200"/>
-                        <w:jc w:val="center"/>
-                        <w:rPr>
-                          <w:color w:val="FFFFFF"/>
-                        </w:rPr>
-                      </w:pPr>
-                      <w:r>
-                        <w:rPr>
-                          <w:color w:val="FFFFFF"/>
-                        </w:rPr>
-                        <w:t>Your photo</w:t>
-                      </w:r>
-                    </w:p>
-                  </w:txbxContent>
-                </v:textbox>
-                <w10:wrap type="none"/>
-              </v:rect>
-            </w:pict>
-          </mc:Fallback>
-        </mc:AlternateContent>
-      </w:r>
-    </w:p>
-    <w:p>
-      <w:pPr>
-        <w:pStyle w:val="Normal"/>
-        <w:rPr>
-          <w:rFonts w:cs="" w:asciiTheme="majorBidi" w:cstheme="majorBidi" w:hAnsiTheme="majorBidi"/>
-          <w:sz w:val="24"/>
-          <w:szCs w:val="24"/>
-        </w:rPr>
-      </w:pPr>
-      <w:r>
-        <w:drawing>
-          <wp:anchor distT="0" distB="0" distL="0" distR="0" simplePos="0" relativeHeight="5" behindDoc="0" locked="0" layoutInCell="0" allowOverlap="1">
-            <wp:simplePos x="0" y="0"/>
-            <wp:positionH relativeFrom="column">
-              <wp:posOffset>-76200</wp:posOffset>
-            </wp:positionH>
-            <wp:positionV relativeFrom="paragraph">
-              <wp:posOffset>-94615</wp:posOffset>
-            </wp:positionV>
-            <wp:extent cx="983615" cy="1288415"/>
-            <wp:effectExtent l="0" t="0" r="0" b="0"/>
-            <wp:wrapSquare wrapText="largest"/>
-            <wp:docPr id="3" name="Image1"/>
-            <wp:cNvGraphicFramePr>
-              <a:graphicFrameLocks xmlns:a="http://schemas.openxmlformats.org/drawingml/2006/main" noChangeAspect="1"/>
-            </wp:cNvGraphicFramePr>
-            <a:graphic xmlns:a="http://schemas.openxmlformats.org/drawingml/2006/main">
-              <a:graphicData uri="http://schemas.openxmlformats.org/drawingml/2006/picture">
-                <pic:pic xmlns:pic="http://schemas.openxmlformats.org/drawingml/2006/picture">
-                  <pic:nvPicPr>
-                    <pic:cNvPr id="3" name="Image1"/>
-                    <pic:cNvPicPr>
-                      <a:picLocks noChangeAspect="1" noChangeArrowheads="1"/>
-                    </pic:cNvPicPr>
-                  </pic:nvPicPr>
-                  <pic:blipFill>
-                    <a:blip r:embed="rId3"/>
                     <a:stretch>
                       <a:fillRect/>
                     </a:stretch>
@@ -225,6 +56,16 @@
           </wp:anchor>
         </w:drawing>
       </w:r>
+    </w:p>
+    <w:p>
+      <w:pPr>
+        <w:pStyle w:val="Normal"/>
+        <w:rPr>
+          <w:rFonts w:cs="" w:asciiTheme="majorBidi" w:cstheme="majorBidi" w:hAnsiTheme="majorBidi"/>
+          <w:sz w:val="24"/>
+          <w:szCs w:val="24"/>
+        </w:rPr>
+      </w:pPr>
       <w:r>
         <w:rPr/>
         <w:t xml:space="preserve"> </w:t>
@@ -909,15 +750,15 @@
       <w:szCs w:val="24"/>
     </w:rPr>
   </w:style>
+  <w:style w:type="paragraph" w:styleId="FrameContents">
+    <w:name w:val="Frame Contents"/>
+    <w:basedOn w:val="Normal"/>
+    <w:qFormat/>
+    <w:pPr/>
+    <w:rPr/>
+  </w:style>
   <w:style w:type="paragraph" w:styleId="FrameContentsuser">
     <w:name w:val="Frame Contents (user)"/>
-    <w:basedOn w:val="Normal"/>
-    <w:qFormat/>
-    <w:pPr/>
-    <w:rPr/>
-  </w:style>
-  <w:style w:type="paragraph" w:styleId="FrameContents">
-    <w:name w:val="Frame Contents"/>
     <w:basedOn w:val="Normal"/>
     <w:qFormat/>
     <w:pPr/>

</xml_diff>